<commit_message>
12/1 Added Readme file
</commit_message>
<xml_diff>
--- a/README.docx
+++ b/README.docx
@@ -38,7 +38,19 @@
         <w:rPr>
           <w:rFonts w:ascii="Times New Roman" w:hAnsi="Times New Roman" w:cs="Times New Roman"/>
         </w:rPr>
-        <w:t>Date: 3 December 2025</w:t>
+        <w:t xml:space="preserve">Date: </w:t>
+      </w:r>
+      <w:r>
+        <w:rPr>
+          <w:rFonts w:ascii="Times New Roman" w:hAnsi="Times New Roman" w:cs="Times New Roman"/>
+        </w:rPr>
+        <w:t>2</w:t>
+      </w:r>
+      <w:r>
+        <w:rPr>
+          <w:rFonts w:ascii="Times New Roman" w:hAnsi="Times New Roman" w:cs="Times New Roman"/>
+        </w:rPr>
+        <w:t xml:space="preserve"> December 2025</w:t>
       </w:r>
     </w:p>
     <w:p>
@@ -117,16 +129,8 @@
         <w:rPr>
           <w:rFonts w:ascii="Times New Roman" w:hAnsi="Times New Roman" w:cs="Times New Roman"/>
         </w:rPr>
-        <w:t xml:space="preserve">Data is from </w:t>
-      </w:r>
-      <w:proofErr w:type="spellStart"/>
-      <w:r>
-        <w:rPr>
-          <w:rFonts w:ascii="Times New Roman" w:hAnsi="Times New Roman" w:cs="Times New Roman"/>
-        </w:rPr>
-        <w:t>NEON_litterfall</w:t>
-      </w:r>
-      <w:proofErr w:type="spellEnd"/>
+        <w:t>Data is from NEON_litterfall</w:t>
+      </w:r>
       <w:r>
         <w:rPr>
           <w:rFonts w:ascii="Times New Roman" w:hAnsi="Times New Roman" w:cs="Times New Roman"/>
@@ -149,21 +153,7 @@
         <w:rPr>
           <w:rFonts w:ascii="Times New Roman" w:hAnsi="Times New Roman" w:cs="Times New Roman"/>
         </w:rPr>
-        <w:t xml:space="preserve">. Within </w:t>
-      </w:r>
-      <w:proofErr w:type="spellStart"/>
-      <w:r>
-        <w:rPr>
-          <w:rFonts w:ascii="Times New Roman" w:hAnsi="Times New Roman" w:cs="Times New Roman"/>
-        </w:rPr>
-        <w:t>NEON_litterfall</w:t>
-      </w:r>
-      <w:proofErr w:type="spellEnd"/>
-      <w:r>
-        <w:rPr>
-          <w:rFonts w:ascii="Times New Roman" w:hAnsi="Times New Roman" w:cs="Times New Roman"/>
-        </w:rPr>
-        <w:t xml:space="preserve">, folders corresponding to Bartlett </w:t>
+        <w:t xml:space="preserve">. Within NEON_litterfall, folders corresponding to Bartlett </w:t>
       </w:r>
       <w:r>
         <w:rPr>
@@ -193,21 +183,7 @@
         <w:rPr>
           <w:rFonts w:ascii="Times New Roman" w:hAnsi="Times New Roman" w:cs="Times New Roman"/>
         </w:rPr>
-        <w:t xml:space="preserve">These included seven </w:t>
-      </w:r>
-      <w:proofErr w:type="spellStart"/>
-      <w:r>
-        <w:rPr>
-          <w:rFonts w:ascii="Times New Roman" w:hAnsi="Times New Roman" w:cs="Times New Roman"/>
-        </w:rPr>
-        <w:t>months worth</w:t>
-      </w:r>
-      <w:proofErr w:type="spellEnd"/>
-      <w:r>
-        <w:rPr>
-          <w:rFonts w:ascii="Times New Roman" w:hAnsi="Times New Roman" w:cs="Times New Roman"/>
-        </w:rPr>
-        <w:t xml:space="preserve"> of data, April – July and September – November. </w:t>
+        <w:t xml:space="preserve">These included seven months worth of data, April – July and September – November. </w:t>
       </w:r>
     </w:p>
     <w:p>
@@ -240,7 +216,6 @@
         </w:rPr>
         <w:t>“</w:t>
       </w:r>
-      <w:proofErr w:type="spellStart"/>
       <w:r>
         <w:rPr>
           <w:rFonts w:ascii="Times New Roman" w:hAnsi="Times New Roman" w:cs="Times New Roman"/>
@@ -251,16 +226,8 @@
         <w:rPr>
           <w:rFonts w:ascii="Times New Roman" w:hAnsi="Times New Roman" w:cs="Times New Roman"/>
         </w:rPr>
-        <w:t>massdata</w:t>
-      </w:r>
-      <w:proofErr w:type="spellEnd"/>
-      <w:r>
-        <w:rPr>
-          <w:rFonts w:ascii="Times New Roman" w:hAnsi="Times New Roman" w:cs="Times New Roman"/>
-        </w:rPr>
-        <w:t>” and “</w:t>
-      </w:r>
-      <w:proofErr w:type="spellStart"/>
+        <w:t>massdata” and “</w:t>
+      </w:r>
       <w:r>
         <w:rPr>
           <w:rFonts w:ascii="Times New Roman" w:hAnsi="Times New Roman" w:cs="Times New Roman"/>
@@ -271,14 +238,7 @@
         <w:rPr>
           <w:rFonts w:ascii="Times New Roman" w:hAnsi="Times New Roman" w:cs="Times New Roman"/>
         </w:rPr>
-        <w:t>pertrap</w:t>
-      </w:r>
-      <w:proofErr w:type="spellEnd"/>
-      <w:r>
-        <w:rPr>
-          <w:rFonts w:ascii="Times New Roman" w:hAnsi="Times New Roman" w:cs="Times New Roman"/>
-        </w:rPr>
-        <w:t>”</w:t>
+        <w:t>pertrap”</w:t>
       </w:r>
       <w:r>
         <w:rPr>
@@ -296,21 +256,7 @@
         <w:rPr>
           <w:rFonts w:ascii="Times New Roman" w:hAnsi="Times New Roman" w:cs="Times New Roman"/>
         </w:rPr>
-        <w:t>, spreadsheets for “</w:t>
-      </w:r>
-      <w:proofErr w:type="spellStart"/>
-      <w:r>
-        <w:rPr>
-          <w:rFonts w:ascii="Times New Roman" w:hAnsi="Times New Roman" w:cs="Times New Roman"/>
-        </w:rPr>
-        <w:t>ltr_massdata</w:t>
-      </w:r>
-      <w:proofErr w:type="spellEnd"/>
-      <w:r>
-        <w:rPr>
-          <w:rFonts w:ascii="Times New Roman" w:hAnsi="Times New Roman" w:cs="Times New Roman"/>
-        </w:rPr>
-        <w:t>” include “</w:t>
+        <w:t>, spreadsheets for “ltr_massdata” include “</w:t>
       </w:r>
       <w:r>
         <w:rPr>
@@ -322,21 +268,7 @@
         <w:rPr>
           <w:rFonts w:ascii="Times New Roman" w:hAnsi="Times New Roman" w:cs="Times New Roman"/>
         </w:rPr>
-        <w:t>.” Spreadsheets for “</w:t>
-      </w:r>
-      <w:proofErr w:type="spellStart"/>
-      <w:r>
-        <w:rPr>
-          <w:rFonts w:ascii="Times New Roman" w:hAnsi="Times New Roman" w:cs="Times New Roman"/>
-        </w:rPr>
-        <w:t>ltr_pertrap</w:t>
-      </w:r>
-      <w:proofErr w:type="spellEnd"/>
-      <w:r>
-        <w:rPr>
-          <w:rFonts w:ascii="Times New Roman" w:hAnsi="Times New Roman" w:cs="Times New Roman"/>
-        </w:rPr>
-        <w:t>” include “</w:t>
+        <w:t>.” Spreadsheets for “ltr_pertrap” include “</w:t>
       </w:r>
       <w:r>
         <w:rPr>
@@ -437,21 +369,7 @@
         <w:rPr>
           <w:rFonts w:ascii="Times New Roman" w:hAnsi="Times New Roman" w:cs="Times New Roman"/>
         </w:rPr>
-        <w:t xml:space="preserve">Collected all relevant data into one </w:t>
-      </w:r>
-      <w:proofErr w:type="spellStart"/>
-      <w:r>
-        <w:rPr>
-          <w:rFonts w:ascii="Times New Roman" w:hAnsi="Times New Roman" w:cs="Times New Roman"/>
-        </w:rPr>
-        <w:t>dataframe</w:t>
-      </w:r>
-      <w:proofErr w:type="spellEnd"/>
-      <w:r>
-        <w:rPr>
-          <w:rFonts w:ascii="Times New Roman" w:hAnsi="Times New Roman" w:cs="Times New Roman"/>
-        </w:rPr>
-        <w:t>.</w:t>
+        <w:t>Collected all relevant data into one dataframe.</w:t>
       </w:r>
     </w:p>
     <w:p>
@@ -477,7 +395,6 @@
         </w:rPr>
         <w:t>‘</w:t>
       </w:r>
-      <w:proofErr w:type="spellStart"/>
       <w:r>
         <w:rPr>
           <w:rFonts w:ascii="Times New Roman" w:hAnsi="Times New Roman" w:cs="Times New Roman"/>
@@ -488,34 +405,13 @@
         <w:rPr>
           <w:rFonts w:ascii="Times New Roman" w:hAnsi="Times New Roman" w:cs="Times New Roman"/>
         </w:rPr>
-        <w:t>data</w:t>
-      </w:r>
-      <w:proofErr w:type="spellEnd"/>
-      <w:r>
-        <w:rPr>
-          <w:rFonts w:ascii="Times New Roman" w:hAnsi="Times New Roman" w:cs="Times New Roman"/>
-        </w:rPr>
-        <w:t>’</w:t>
-      </w:r>
-      <w:r>
-        <w:rPr>
-          <w:rFonts w:ascii="Times New Roman" w:hAnsi="Times New Roman" w:cs="Times New Roman"/>
-        </w:rPr>
-        <w:t xml:space="preserve"> </w:t>
-      </w:r>
-      <w:proofErr w:type="spellStart"/>
-      <w:r>
-        <w:rPr>
-          <w:rFonts w:ascii="Times New Roman" w:hAnsi="Times New Roman" w:cs="Times New Roman"/>
-        </w:rPr>
-        <w:t>dataframes</w:t>
-      </w:r>
-      <w:proofErr w:type="spellEnd"/>
-      <w:r>
-        <w:rPr>
-          <w:rFonts w:ascii="Times New Roman" w:hAnsi="Times New Roman" w:cs="Times New Roman"/>
-        </w:rPr>
-        <w:t>, keeping only columns containing data relevant to litter dry mass and corresponding traps.</w:t>
+        <w:t>data’</w:t>
+      </w:r>
+      <w:r>
+        <w:rPr>
+          <w:rFonts w:ascii="Times New Roman" w:hAnsi="Times New Roman" w:cs="Times New Roman"/>
+        </w:rPr>
+        <w:t xml:space="preserve"> dataframes, keeping only columns containing data relevant to litter dry mass and corresponding traps.</w:t>
       </w:r>
     </w:p>
     <w:p>
@@ -541,14 +437,12 @@
         </w:rPr>
         <w:t>‘</w:t>
       </w:r>
-      <w:proofErr w:type="spellStart"/>
       <w:r>
         <w:rPr>
           <w:rFonts w:ascii="Times New Roman" w:hAnsi="Times New Roman" w:cs="Times New Roman"/>
         </w:rPr>
         <w:t>pertrap</w:t>
       </w:r>
-      <w:proofErr w:type="spellEnd"/>
       <w:r>
         <w:rPr>
           <w:rFonts w:ascii="Times New Roman" w:hAnsi="Times New Roman" w:cs="Times New Roman"/>
@@ -559,21 +453,7 @@
         <w:rPr>
           <w:rFonts w:ascii="Times New Roman" w:hAnsi="Times New Roman" w:cs="Times New Roman"/>
         </w:rPr>
-        <w:t xml:space="preserve"> </w:t>
-      </w:r>
-      <w:proofErr w:type="spellStart"/>
-      <w:r>
-        <w:rPr>
-          <w:rFonts w:ascii="Times New Roman" w:hAnsi="Times New Roman" w:cs="Times New Roman"/>
-        </w:rPr>
-        <w:t>dataframes</w:t>
-      </w:r>
-      <w:proofErr w:type="spellEnd"/>
-      <w:r>
-        <w:rPr>
-          <w:rFonts w:ascii="Times New Roman" w:hAnsi="Times New Roman" w:cs="Times New Roman"/>
-        </w:rPr>
-        <w:t>, keeping only columns relevant to trap placement.</w:t>
+        <w:t xml:space="preserve"> dataframes, keeping only columns relevant to trap placement.</w:t>
       </w:r>
     </w:p>
     <w:p>
@@ -591,41 +471,13 @@
         <w:rPr>
           <w:rFonts w:ascii="Times New Roman" w:hAnsi="Times New Roman" w:cs="Times New Roman"/>
         </w:rPr>
-        <w:t xml:space="preserve">Merged mass and trap </w:t>
-      </w:r>
-      <w:proofErr w:type="spellStart"/>
-      <w:r>
-        <w:rPr>
-          <w:rFonts w:ascii="Times New Roman" w:hAnsi="Times New Roman" w:cs="Times New Roman"/>
-        </w:rPr>
-        <w:t>dataframes</w:t>
-      </w:r>
-      <w:proofErr w:type="spellEnd"/>
-      <w:r>
-        <w:rPr>
-          <w:rFonts w:ascii="Times New Roman" w:hAnsi="Times New Roman" w:cs="Times New Roman"/>
-        </w:rPr>
-        <w:t>.</w:t>
-      </w:r>
-      <w:r>
-        <w:rPr>
-          <w:rFonts w:ascii="Times New Roman" w:hAnsi="Times New Roman" w:cs="Times New Roman"/>
-        </w:rPr>
-        <w:t xml:space="preserve"> Ordered by collection date and </w:t>
-      </w:r>
-      <w:proofErr w:type="spellStart"/>
-      <w:r>
-        <w:rPr>
-          <w:rFonts w:ascii="Times New Roman" w:hAnsi="Times New Roman" w:cs="Times New Roman"/>
-        </w:rPr>
-        <w:t>trapID</w:t>
-      </w:r>
-      <w:proofErr w:type="spellEnd"/>
-      <w:r>
-        <w:rPr>
-          <w:rFonts w:ascii="Times New Roman" w:hAnsi="Times New Roman" w:cs="Times New Roman"/>
-        </w:rPr>
-        <w:t xml:space="preserve"> to keep data in month order.</w:t>
+        <w:t>Merged mass and trap dataframes.</w:t>
+      </w:r>
+      <w:r>
+        <w:rPr>
+          <w:rFonts w:ascii="Times New Roman" w:hAnsi="Times New Roman" w:cs="Times New Roman"/>
+        </w:rPr>
+        <w:t xml:space="preserve"> Ordered by collection date and trapID to keep data in month order.</w:t>
       </w:r>
     </w:p>
     <w:p>
@@ -655,21 +507,7 @@
         <w:rPr>
           <w:rFonts w:ascii="Times New Roman" w:hAnsi="Times New Roman" w:cs="Times New Roman"/>
         </w:rPr>
-        <w:t xml:space="preserve"> </w:t>
-      </w:r>
-      <w:proofErr w:type="spellStart"/>
-      <w:r>
-        <w:rPr>
-          <w:rFonts w:ascii="Times New Roman" w:hAnsi="Times New Roman" w:cs="Times New Roman"/>
-        </w:rPr>
-        <w:t>dataframe</w:t>
-      </w:r>
-      <w:proofErr w:type="spellEnd"/>
-      <w:r>
-        <w:rPr>
-          <w:rFonts w:ascii="Times New Roman" w:hAnsi="Times New Roman" w:cs="Times New Roman"/>
-        </w:rPr>
-        <w:t xml:space="preserve"> with</w:t>
+        <w:t xml:space="preserve"> dataframe with</w:t>
       </w:r>
       <w:r>
         <w:rPr>
@@ -705,35 +543,7 @@
         <w:rPr>
           <w:rFonts w:ascii="Times New Roman" w:hAnsi="Times New Roman" w:cs="Times New Roman"/>
         </w:rPr>
-        <w:t xml:space="preserve"> ‘</w:t>
-      </w:r>
-      <w:proofErr w:type="spellStart"/>
-      <w:r>
-        <w:rPr>
-          <w:rFonts w:ascii="Times New Roman" w:hAnsi="Times New Roman" w:cs="Times New Roman"/>
-        </w:rPr>
-        <w:t>calc_drymass_</w:t>
-      </w:r>
-      <w:proofErr w:type="gramStart"/>
-      <w:r>
-        <w:rPr>
-          <w:rFonts w:ascii="Times New Roman" w:hAnsi="Times New Roman" w:cs="Times New Roman"/>
-        </w:rPr>
-        <w:t>rate</w:t>
-      </w:r>
-      <w:proofErr w:type="spellEnd"/>
-      <w:r>
-        <w:rPr>
-          <w:rFonts w:ascii="Times New Roman" w:hAnsi="Times New Roman" w:cs="Times New Roman"/>
-        </w:rPr>
-        <w:t>(</w:t>
-      </w:r>
-      <w:proofErr w:type="gramEnd"/>
-      <w:r>
-        <w:rPr>
-          <w:rFonts w:ascii="Times New Roman" w:hAnsi="Times New Roman" w:cs="Times New Roman"/>
-        </w:rPr>
-        <w:t>)’</w:t>
+        <w:t xml:space="preserve"> ‘calc_drymass_rate()’</w:t>
       </w:r>
       <w:r>
         <w:rPr>
@@ -884,21 +694,7 @@
         <w:rPr>
           <w:rFonts w:ascii="Times New Roman" w:hAnsi="Times New Roman" w:cs="Times New Roman"/>
         </w:rPr>
-        <w:t xml:space="preserve">The report includes tables summarizing mean daily litterfall per month and per litter source functional </w:t>
-      </w:r>
-      <w:proofErr w:type="gramStart"/>
-      <w:r>
-        <w:rPr>
-          <w:rFonts w:ascii="Times New Roman" w:hAnsi="Times New Roman" w:cs="Times New Roman"/>
-        </w:rPr>
-        <w:t>group, and</w:t>
-      </w:r>
-      <w:proofErr w:type="gramEnd"/>
-      <w:r>
-        <w:rPr>
-          <w:rFonts w:ascii="Times New Roman" w:hAnsi="Times New Roman" w:cs="Times New Roman"/>
-        </w:rPr>
-        <w:t xml:space="preserve"> shows the standard deviations in the means. </w:t>
+        <w:t xml:space="preserve">The report includes tables summarizing mean daily litterfall per month and per litter source functional group, and shows the standard deviations in the means. </w:t>
       </w:r>
       <w:r>
         <w:rPr>
@@ -965,84 +761,12 @@
         </w:rPr>
         <w:t xml:space="preserve">Packages used: </w:t>
       </w:r>
-      <w:proofErr w:type="spellStart"/>
-      <w:r>
-        <w:rPr>
-          <w:rFonts w:ascii="Times New Roman" w:hAnsi="Times New Roman" w:cs="Times New Roman"/>
-        </w:rPr>
-        <w:t>tidyverse</w:t>
-      </w:r>
-      <w:proofErr w:type="spellEnd"/>
-      <w:r>
-        <w:rPr>
-          <w:rFonts w:ascii="Times New Roman" w:hAnsi="Times New Roman" w:cs="Times New Roman"/>
-        </w:rPr>
-        <w:t xml:space="preserve">, ggplot2, </w:t>
-      </w:r>
-      <w:proofErr w:type="spellStart"/>
-      <w:r>
-        <w:rPr>
-          <w:rFonts w:ascii="Times New Roman" w:hAnsi="Times New Roman" w:cs="Times New Roman"/>
-        </w:rPr>
-        <w:t>dplyr</w:t>
-      </w:r>
-      <w:proofErr w:type="spellEnd"/>
-      <w:r>
-        <w:rPr>
-          <w:rFonts w:ascii="Times New Roman" w:hAnsi="Times New Roman" w:cs="Times New Roman"/>
-        </w:rPr>
-        <w:t xml:space="preserve">, </w:t>
-      </w:r>
-      <w:proofErr w:type="spellStart"/>
-      <w:r>
-        <w:rPr>
-          <w:rFonts w:ascii="Times New Roman" w:hAnsi="Times New Roman" w:cs="Times New Roman"/>
-        </w:rPr>
-        <w:t>stringr</w:t>
-      </w:r>
-      <w:proofErr w:type="spellEnd"/>
-      <w:r>
-        <w:rPr>
-          <w:rFonts w:ascii="Times New Roman" w:hAnsi="Times New Roman" w:cs="Times New Roman"/>
-        </w:rPr>
-        <w:t xml:space="preserve">, </w:t>
-      </w:r>
-      <w:proofErr w:type="spellStart"/>
-      <w:r>
-        <w:rPr>
-          <w:rFonts w:ascii="Times New Roman" w:hAnsi="Times New Roman" w:cs="Times New Roman"/>
-        </w:rPr>
-        <w:t>lubridate</w:t>
-      </w:r>
-      <w:proofErr w:type="spellEnd"/>
-      <w:r>
-        <w:rPr>
-          <w:rFonts w:ascii="Times New Roman" w:hAnsi="Times New Roman" w:cs="Times New Roman"/>
-        </w:rPr>
-        <w:t xml:space="preserve">, </w:t>
-      </w:r>
-      <w:proofErr w:type="spellStart"/>
-      <w:r>
-        <w:rPr>
-          <w:rFonts w:ascii="Times New Roman" w:hAnsi="Times New Roman" w:cs="Times New Roman"/>
-        </w:rPr>
-        <w:t>knitr</w:t>
-      </w:r>
-      <w:proofErr w:type="spellEnd"/>
-      <w:r>
-        <w:rPr>
-          <w:rFonts w:ascii="Times New Roman" w:hAnsi="Times New Roman" w:cs="Times New Roman"/>
-        </w:rPr>
-        <w:t xml:space="preserve">, here, </w:t>
-      </w:r>
-      <w:proofErr w:type="spellStart"/>
-      <w:r>
-        <w:rPr>
-          <w:rFonts w:ascii="Times New Roman" w:hAnsi="Times New Roman" w:cs="Times New Roman"/>
-        </w:rPr>
-        <w:t>RColorBrewer</w:t>
-      </w:r>
-      <w:proofErr w:type="spellEnd"/>
+      <w:r>
+        <w:rPr>
+          <w:rFonts w:ascii="Times New Roman" w:hAnsi="Times New Roman" w:cs="Times New Roman"/>
+        </w:rPr>
+        <w:t>tidyverse, ggplot2, dplyr, stringr, lubridate, knitr, here, RColorBrewer</w:t>
+      </w:r>
     </w:p>
     <w:p>
       <w:pPr>
@@ -1968,6 +1692,7 @@
   <w:style w:type="character" w:default="1" w:styleId="DefaultParagraphFont">
     <w:name w:val="Default Paragraph Font"/>
     <w:uiPriority w:val="1"/>
+    <w:semiHidden/>
     <w:unhideWhenUsed/>
   </w:style>
   <w:style w:type="table" w:default="1" w:styleId="TableNormal">

</xml_diff>